<commit_message>
Use 'documented interface' and expand disclosure docs
Replace references to "public interface" with "documented input/interface" across several 501c3 docs and diagrams for precision. Expand the invention disclosure with a draft public-disclosure timeline, detailed result/artifact paths (eval scripts, summaries, claim maps, public indexes), inventor-conception notes, and AI-tool-use guidance. Update apparatus graphs and SVG text to match wording change. Also update binary figures and the provisional application docx.
</commit_message>
<xml_diff>
--- a/docs/501c3/HALO_HARNESS_PROVISIONAL_APPLICATION_v0.1_DRAFT.docx
+++ b/docs/501c3/HALO_HARNESS_PROVISIONAL_APPLICATION_v0.1_DRAFT.docx
@@ -1,5 +1,29 @@
 
-<file path=word/document.xml><?xml version="1.0" encoding="utf-8"?>
+<file path=docProps\app.xml><?xml version="1.0" encoding="utf-8"?>
+<Properties xmlns="http://schemas.openxmlformats.org/officeDocument/2006/extended-properties" xmlns:vt="http://schemas.openxmlformats.org/officeDocument/2006/docPropsVTypes"/>
+</file>
+
+<file path=docProps\core.xml><?xml version="1.0" encoding="utf-8"?>
+<cp:coreProperties xmlns:cp="http://schemas.openxmlformats.org/package/2006/metadata/core-properties" xmlns:dc="http://purl.org/dc/elements/1.1/" xmlns:dcterms="http://purl.org/dc/terms/" xmlns:dcmitype="http://purl.org/dc/dcmitype/" xmlns:xsi="http://www.w3.org/2001/XMLSchema-instance">
+  <dc:title>Halo Traceability Harness — Provisional Patent Application v0.1 (DRAFT)</dc:title>
+  <dc:creator>Jeffery Wade Hughes Jr.</dc:creator>
+  <dc:description>Counsel-review draft of provisional patent application for the Halo Traceability Harness.</dc:description>
+  <cp:lastModifiedBy>Un-named</cp:lastModifiedBy>
+  <cp:revision>1</cp:revision>
+  <dcterms:created xsi:type="dcterms:W3CDTF">2026-05-27T00:46:13.816Z</dcterms:created>
+  <dcterms:modified xsi:type="dcterms:W3CDTF">2026-05-27T00:46:13.816Z</dcterms:modified>
+</cp:coreProperties>
+</file>
+
+<file path=docProps\custom.xml><?xml version="1.0" encoding="utf-8"?>
+<Properties xmlns="http://schemas.openxmlformats.org/officeDocument/2006/custom-properties" xmlns:vt="http://schemas.openxmlformats.org/officeDocument/2006/docPropsVTypes"/>
+</file>
+
+<file path=word\comments.xml><?xml version="1.0" encoding="utf-8"?>
+<w:comments xmlns:cx="http://schemas.microsoft.com/office/drawing/2014/chartex" xmlns:cx1="http://schemas.microsoft.com/office/drawing/2015/9/8/chartex" xmlns:cx2="http://schemas.microsoft.com/office/drawing/2015/10/21/chartex" xmlns:cx3="http://schemas.microsoft.com/office/drawing/2016/5/9/chartex" xmlns:cx4="http://schemas.microsoft.com/office/drawing/2016/5/10/chartex" xmlns:cx5="http://schemas.microsoft.com/office/drawing/2016/5/11/chartex" xmlns:cx6="http://schemas.microsoft.com/office/drawing/2016/5/12/chartex" xmlns:cx7="http://schemas.microsoft.com/office/drawing/2016/5/13/chartex" xmlns:cx8="http://schemas.microsoft.com/office/drawing/2016/5/14/chartex" xmlns:mc="http://schemas.openxmlformats.org/markup-compatibility/2006" xmlns:aink="http://schemas.microsoft.com/office/drawing/2016/ink" xmlns:am3d="http://schemas.microsoft.com/office/drawing/2017/model3d" xmlns:o="urn:schemas-microsoft-com:office:office" xmlns:r="http://schemas.openxmlformats.org/officeDocument/2006/relationships" xmlns:m="http://schemas.openxmlformats.org/officeDocument/2006/math" xmlns:v="urn:schemas-microsoft-com:vml" xmlns:wp14="http://schemas.microsoft.com/office/word/2010/wordprocessingDrawing" xmlns:wp="http://schemas.openxmlformats.org/drawingml/2006/wordprocessingDrawing" xmlns:w10="urn:schemas-microsoft-com:office:word" xmlns:w="http://schemas.openxmlformats.org/wordprocessingml/2006/main" xmlns:w14="http://schemas.microsoft.com/office/word/2010/wordml" xmlns:w15="http://schemas.microsoft.com/office/word/2012/wordml" xmlns:w16cex="http://schemas.microsoft.com/office/word/2018/wordml/cex" xmlns:w16cid="http://schemas.microsoft.com/office/word/2016/wordml/cid" xmlns:w16="http://schemas.microsoft.com/office/word/2018/wordml" xmlns:w16sdtdh="http://schemas.microsoft.com/office/word/2020/wordml/sdtdatahash" xmlns:w16se="http://schemas.microsoft.com/office/word/2015/wordml/symex" xmlns:wpg="http://schemas.microsoft.com/office/word/2010/wordprocessingGroup" xmlns:wpi="http://schemas.microsoft.com/office/word/2010/wordprocessingInk" xmlns:wne="http://schemas.microsoft.com/office/word/2006/wordml" xmlns:wps="http://schemas.microsoft.com/office/word/2010/wordprocessingShape"/>
+</file>
+
+<file path=word\document.xml><?xml version="1.0" encoding="utf-8"?>
 <w:document xmlns:wpc="http://schemas.microsoft.com/office/word/2010/wordprocessingCanvas" xmlns:mc="http://schemas.openxmlformats.org/markup-compatibility/2006" xmlns:o="urn:schemas-microsoft-com:office:office" xmlns:r="http://schemas.openxmlformats.org/officeDocument/2006/relationships" xmlns:m="http://schemas.openxmlformats.org/officeDocument/2006/math" xmlns:v="urn:schemas-microsoft-com:vml" xmlns:wp14="http://schemas.microsoft.com/office/word/2010/wordprocessingDrawing" xmlns:wp="http://schemas.openxmlformats.org/drawingml/2006/wordprocessingDrawing" xmlns:w10="urn:schemas-microsoft-com:office:word" xmlns:w="http://schemas.openxmlformats.org/wordprocessingml/2006/main" xmlns:w14="http://schemas.microsoft.com/office/word/2010/wordml" xmlns:w15="http://schemas.microsoft.com/office/word/2012/wordml" xmlns:wpg="http://schemas.microsoft.com/office/word/2010/wordprocessingGroup" xmlns:wpi="http://schemas.microsoft.com/office/word/2010/wordprocessingInk" xmlns:wne="http://schemas.microsoft.com/office/word/2006/wordml" xmlns:wps="http://schemas.microsoft.com/office/word/2010/wordprocessingShape" xmlns:cx="http://schemas.microsoft.com/office/drawing/2014/chartex" xmlns:cx1="http://schemas.microsoft.com/office/drawing/2015/9/8/chartex" xmlns:cx2="http://schemas.microsoft.com/office/drawing/2015/10/21/chartex" xmlns:cx3="http://schemas.microsoft.com/office/drawing/2016/5/9/chartex" xmlns:cx4="http://schemas.microsoft.com/office/drawing/2016/5/10/chartex" xmlns:cx5="http://schemas.microsoft.com/office/drawing/2016/5/11/chartex" xmlns:cx6="http://schemas.microsoft.com/office/drawing/2016/5/12/chartex" xmlns:cx7="http://schemas.microsoft.com/office/drawing/2016/5/13/chartex" xmlns:cx8="http://schemas.microsoft.com/office/drawing/2016/5/14/chartex" xmlns:aink="http://schemas.microsoft.com/office/drawing/2016/ink" xmlns:am3d="http://schemas.microsoft.com/office/drawing/2017/model3d" xmlns:w16cex="http://schemas.microsoft.com/office/word/2018/wordml/cex" xmlns:w16cid="http://schemas.microsoft.com/office/word/2016/wordml/cid" xmlns:w16="http://schemas.microsoft.com/office/word/2018/wordml" xmlns:w16sdtdh="http://schemas.microsoft.com/office/word/2020/wordml/sdtdatahash" xmlns:w16se="http://schemas.microsoft.com/office/word/2015/wordml/symex" mc:Ignorable="w14 w15 wp14">
   <w:body>
     <w:p>
@@ -171,7 +195,7 @@
         <w:rPr>
           <w:rFonts w:ascii="Arial" w:cs="Arial" w:eastAsia="Arial" w:hAnsi="Arial"/>
         </w:rPr>
-        <w:t xml:space="preserve">Draft date: May 27, 2026</w:t>
+        <w:t xml:space="preserve">Draft date: May 26, 2026</w:t>
       </w:r>
     </w:p>
     <w:p>
@@ -336,7 +360,7 @@
         <w:rPr>
           <w:rFonts w:ascii="Arial" w:cs="Arial" w:eastAsia="Arial" w:hAnsi="Arial"/>
         </w:rPr>
-        <w:t xml:space="preserve">The present invention relates generally to the technical field of evaluation and audit of deployed artificial-intelligence (AI) systems, and more particularly to apparatus and methods for measuring claim discipline of such systems through an evaluator-side proxy that operates exclusively against the AI system’s public interface and without requiring cooperation from, instrumentation of, or access to internal state of the system under evaluation.</w:t>
+        <w:t xml:space="preserve">The present invention relates generally to the technical field of evaluation and audit of deployed artificial-intelligence (AI) systems, and more particularly to apparatus and methods for measuring claim discipline of such systems through an evaluator-side proxy that operates exclusively against the AI system’s documented input interface and without requiring instrumentation of, modification to, or access to non-public internal state of the system under evaluation.</w:t>
       </w:r>
     </w:p>
     <w:p>
@@ -448,7 +472,7 @@
         <w:rPr>
           <w:rFonts w:ascii="Arial" w:cs="Arial" w:eastAsia="Arial" w:hAnsi="Arial"/>
         </w:rPr>
-        <w:t xml:space="preserve">There is accordingly an unmet need in the art for an apparatus and method that (a) measures claim discipline of a Deployment through observable surfaces only, using nothing more than the Deployment’s ordinary public interface; (b) decomposes the Deployment’s free-text outputs into per-claim records with provenance, uncertainty, refusal, and boundary markers under an invariant schema; (c) persists the resulting records in a replayable audit store; (d) reduces the records to a principle-indexed metric set that is comparable across distinct Deployments; and (e) emits a structured Traceability Evaluation Report that documents both what was measured and what was deliberately not measured. The present invention addresses each of these needs.</w:t>
+        <w:t xml:space="preserve">There is accordingly an unmet need in the art for an apparatus and method that (a) measures claim discipline of a Deployment through observable surfaces only, using nothing more than the Deployment’s ordinary documented input interface; (b) decomposes the Deployment’s free-text outputs into per-claim records with provenance, uncertainty, refusal, and boundary markers under an invariant schema; (c) persists the resulting records in a replayable audit store; (d) reduces the records to a principle-indexed metric set that is comparable across distinct Deployments; and (e) emits a structured Traceability Evaluation Report that documents both what was measured and what was deliberately not measured. The present invention addresses each of these needs.</w:t>
       </w:r>
     </w:p>
     <w:p>
@@ -484,7 +508,7 @@
         <w:rPr>
           <w:rFonts w:ascii="Arial" w:cs="Arial" w:eastAsia="Arial" w:hAnsi="Arial"/>
         </w:rPr>
-        <w:t xml:space="preserve">Disclosed herein are an apparatus and a method for evaluator-side claim-discipline evaluation of deployed AI systems. In one broad aspect, the apparatus, designated herein as a Halo Traceability Harness (also “the apparatus,” reference numeral 100), comprises: a Prompt Set Module (102) configured to provide a versioned, category-labeled corpus of prompt records; an Evaluator-Side Proxy (104) configured to issue serialized prompts to a Deployment Under Evaluation (106) via the Deployment’s public interface and to capture verbatim responses from the Deployment; a Tagger (108) configured to decompose each captured response into per-claim records and to apply, to each per-claim record, an invariant marker schema comprising at least a provenance classification, an uncertainty marker set, and a refusal classification; an Audit Store (110) configured to persist tagged interaction records against a published schema, indexed by an evaluation run identifier; a Scoring Module (112) configured to reduce a set of tagged interaction records to a principle-indexed metric set bearing a status matrix that distinguishes principles that are instrumented from principles that are deferred or paper-level-only; and a Report Renderer (114) configured to emit a Traceability Evaluation Report (116) from the principle-indexed metric set.</w:t>
+        <w:t xml:space="preserve">Disclosed herein are an apparatus and a method for evaluator-side claim-discipline evaluation of deployed AI systems. In one broad aspect, the apparatus, designated herein as a Halo Traceability Harness (also “the apparatus,” reference numeral 100), comprises: a Prompt Set Module (102) configured to provide a versioned, category-labeled corpus of prompt records; an Evaluator-Side Proxy (104) configured to issue serialized prompts to a Deployment Under Evaluation (106) via the Deployment’s documented input interface and to capture verbatim responses from the Deployment; a Tagger (108) configured to decompose each captured response into per-claim records and to apply, to each per-claim record or to an associated response-level record, an invariant marker schema comprising at least a provenance classification, an uncertainty marker set, and a refusal classification; an Audit Store (110) configured to persist tagged interaction records against a published schema, indexed by an evaluation run identifier; a Scoring Module (112) configured to reduce a set of tagged interaction records to a principle-indexed metric set bearing a status matrix that distinguishes principles that are instrumented from principles that are deferred or paper-level-only; and a Report Renderer (114) configured to emit a Traceability Evaluation Report (116) from the principle-indexed metric set.</w:t>
       </w:r>
     </w:p>
     <w:p>
@@ -504,7 +528,7 @@
         <w:rPr>
           <w:rFonts w:ascii="Arial" w:cs="Arial" w:eastAsia="Arial" w:hAnsi="Arial"/>
         </w:rPr>
-        <w:t xml:space="preserve">A defining property of the present invention is that the apparatus operates wholly outside the Deployment Under Evaluation 106. The Deployment is treated as a black box accessed only through documented public interfaces. No software-development kit, instrumentation hook, log access, chain-of-thought trace, or model-weight access is required at any step. The apparatus boundary is depicted in the accompanying drawings as element 101, with the Deployment 106 expressly shown outside that boundary.</w:t>
+        <w:t xml:space="preserve">A defining property of the present invention is that the apparatus operates wholly outside the Deployment Under Evaluation 106. The Deployment is treated as a black box accessed only through documented input interfaces. No software-development kit, instrumentation hook, log access, chain-of-thought trace, or model-weight access is required at any step. The apparatus boundary is depicted in the accompanying drawings as element 101, with the Deployment 106 expressly shown outside that boundary.</w:t>
       </w:r>
     </w:p>
     <w:p>
@@ -524,7 +548,7 @@
         <w:rPr>
           <w:rFonts w:ascii="Arial" w:cs="Arial" w:eastAsia="Arial" w:hAnsi="Arial"/>
         </w:rPr>
-        <w:t xml:space="preserve">In another broad aspect, the invention discloses a corresponding method comprising steps S1 through S8 of: (S1) providing a prompt record from the Prompt Set Module to the Evaluator-Side Proxy; (S2) issuing the prompt record as a serialized prompt to the Deployment via its public interface; (S3) receiving a verbatim response from the Deployment; (S4) assembling a capture record from the prompt and response and passing the capture record to the Tagger; (S5) decomposing the response into per-claim records, applying the invariant marker schema, and writing the resulting tagged interaction record to the Audit Store; (S6) querying the Audit Store by evaluation run identifier to obtain a record set; (S7) reducing the record set to a principle-indexed metric set bearing the status matrix; and (S8) rendering the Traceability Evaluation Report from the principle-indexed metric set.</w:t>
+        <w:t xml:space="preserve">In another broad aspect, the invention discloses a corresponding method comprising steps S1 through S8 of: (S1) providing a prompt record from the Prompt Set Module to the Evaluator-Side Proxy; (S2) issuing the prompt record as a serialized prompt to the Deployment via its documented input interface; (S3) receiving a verbatim response from the Deployment; (S4) assembling a capture record from the prompt and response and passing the capture record to the Tagger; (S5) decomposing the response into per-claim records, applying the invariant marker schema, and writing the resulting tagged interaction record to the Audit Store; (S6) querying the Audit Store by evaluation run identifier to obtain a record set; (S7) reducing the record set to a principle-indexed metric set bearing the status matrix; and (S8) rendering the Traceability Evaluation Report from the principle-indexed metric set.</w:t>
       </w:r>
     </w:p>
     <w:p>
@@ -764,7 +788,7 @@
         <w:rPr>
           <w:rFonts w:ascii="Arial" w:cs="Arial" w:eastAsia="Arial" w:hAnsi="Arial"/>
         </w:rPr>
-        <w:t xml:space="preserve">Referring now to FIG. 1, an apparatus 100 according to one embodiment of the present invention comprises: a Prompt Set Module 102; an Evaluator-Side Proxy 104; a Tagger 108; an Audit Store 110; a Scoring Module 112; and a Report Renderer 114. The apparatus 100 is enclosed by an apparatus boundary 101, indicated in FIG. 1 by a dashed-line rectangle. A Deployment Under Evaluation 106 is disposed external to the apparatus boundary 101 and is accessed by the Evaluator-Side Proxy 104 solely through one or more documented public interfaces of the Deployment 106. Data-flow edges 202, 204, 206, 208, 210, 212, 214, and 216 connect the foregoing components in the order shown and described.</w:t>
+        <w:t xml:space="preserve">Referring now to FIG. 1, an apparatus 100 according to one embodiment of the present invention comprises: a Prompt Set Module 102; an Evaluator-Side Proxy 104; a Tagger 108; an Audit Store 110; a Scoring Module 112; and a Report Renderer 114. The apparatus 100 is enclosed by an apparatus boundary 101, indicated in FIG. 1 by a dashed-line rectangle. A Deployment Under Evaluation 106 is disposed external to the apparatus boundary 101 and is accessed by the Evaluator-Side Proxy 104 solely through one or more documented input interfaces of the Deployment 106. Data-flow edges 202, 204, 206, 208, 210, 212, 214, and 216 connect the foregoing components in the order shown and described.</w:t>
       </w:r>
     </w:p>
     <w:p>
@@ -838,7 +862,7 @@
         <w:rPr>
           <w:rFonts w:ascii="Arial" w:cs="Arial" w:eastAsia="Arial" w:hAnsi="Arial"/>
         </w:rPr>
-        <w:t xml:space="preserve">The Prompt Set Module 102 is configured to curate and provide a versioned corpus of prompt records. Each prompt record carries at minimum a prompt identifier, a prompt text, a category label, and one or more fields specifying expected boundary behavior. In one preferred embodiment, category labels are drawn from a fixed taxonomy including the categories “answerable,” “ambiguous,” “out-of-corpus,” “adversarial,” and “citation-trap.”</w:t>
+        <w:t xml:space="preserve">The Prompt Set Module 102 is configured to curate and provide a versioned corpus of prompt records. Each prompt record carries at minimum a prompt identifier, a prompt text, a category label, and one or more fields specifying expected boundary behavior. In one preferred embodiment, category labels are drawn from a predefined taxonomy including, without limitation, the categories “answerable,” “ambiguous,” “out-of-corpus,” “adversarial,” and “citation-trap.”</w:t>
       </w:r>
     </w:p>
     <w:p>
@@ -916,7 +940,7 @@
         <w:rPr>
           <w:rFonts w:ascii="Arial" w:cs="Arial" w:eastAsia="Arial" w:hAnsi="Arial"/>
         </w:rPr>
-        <w:t xml:space="preserve">The Evaluator-Side Proxy 104 is configured to receive a prompt record 202 from the Prompt Set Module 102 and to issue, by way of the data-flow edge 204, a serialized prompt to the Deployment Under Evaluation 106 across the apparatus boundary 101. The Evaluator-Side Proxy 104 transmits the serialized prompt over any documented public interface of the Deployment 106, including without limitation a Hypertext Transfer Protocol (HTTP) request, a remote-procedure-call (RPC) request, a WebSocket message, or any other channel by which the Deployment 106 ordinarily accepts public input.</w:t>
+        <w:t xml:space="preserve">The Evaluator-Side Proxy 104 is configured to receive a prompt record 202 from the Prompt Set Module 102 and to issue, by way of the data-flow edge 204, a serialized prompt to the Deployment Under Evaluation 106 across the apparatus boundary 101. The Evaluator-Side Proxy 104 transmits the serialized prompt over any documented input interface of the Deployment 106, including without limitation a Hypertext Transfer Protocol (HTTP) request, a remote-procedure-call (RPC) request, a WebSocket message, or any other channel by which the Deployment 106 ordinarily accepts input.</w:t>
       </w:r>
     </w:p>
     <w:p>
@@ -956,7 +980,7 @@
         <w:rPr>
           <w:rFonts w:ascii="Arial" w:cs="Arial" w:eastAsia="Arial" w:hAnsi="Arial"/>
         </w:rPr>
-        <w:t xml:space="preserve">A defining characteristic of the Evaluator-Side Proxy 104 is that it does not require, depend on, or otherwise consume any non-public state of the Deployment 106. The Evaluator-Side Proxy 104 does not perform installation of any software-development kit, library, instrumentation hook, agent, sidecar, or wrapper on or within the Deployment 106; it does not request, receive, or consume any logging output, chain-of-thought trace, intermediate reasoning record, retrieval pipeline state, embedding state, attention pattern, or model weight value from the Deployment 106; and it does not require the cooperation of any operator of the Deployment 106 beyond ordinary acceptance of public-interface traffic. The combination of these properties is referred to herein as the “evaluator-side-only” property of the apparatus 100.</w:t>
+        <w:t xml:space="preserve">A defining characteristic of the Evaluator-Side Proxy 104 is that it does not require, depend on, or otherwise consume any non-public state of the Deployment 106. The Evaluator-Side Proxy 104 does not perform installation of any software-development kit, library, instrumentation hook, agent, sidecar, or wrapper on or within the Deployment 106; it does not request, receive, or consume any logging output, chain-of-thought trace, intermediate reasoning record, retrieval pipeline state, embedding state, attention pattern, or model weight value from the Deployment 106; and it does not require the cooperation of any operator of the Deployment 106 beyond ordinary processing of traffic through the documented input interface. The combination of these properties is referred to herein as the “evaluator-side-only” property of the apparatus 100.</w:t>
       </w:r>
     </w:p>
     <w:p>
@@ -1014,7 +1038,7 @@
         <w:rPr>
           <w:rFonts w:ascii="Arial" w:cs="Arial" w:eastAsia="Arial" w:hAnsi="Arial"/>
         </w:rPr>
-        <w:t xml:space="preserve">The Deployment Under Evaluation 106 is external to the apparatus boundary 101 and is not part of the claimed apparatus. The Deployment 106 is treated by the apparatus 100 as a black box accessed only through its documented public interface. Examples of a Deployment include, without limitation, a deployed large language model accessed via a public application-programming interface (API), a retrieval-augmented generation system, a chat-style assistant available through a website, a voice assistant, an image-generation system, or any combination of the foregoing.</w:t>
+        <w:t xml:space="preserve">The Deployment Under Evaluation 106 is external to the apparatus boundary 101 and is not part of the claimed apparatus. The Deployment 106 is treated by the apparatus 100 as a black box accessed only through its documented input interface. Examples of a Deployment include, without limitation, a deployed large language model accessed via a documented application-programming interface (API), a retrieval-augmented generation system, a chat-style assistant available through a website, a voice assistant, an image-generation system, or any combination of the foregoing.</w:t>
       </w:r>
     </w:p>
     <w:p>
@@ -1034,7 +1058,7 @@
         <w:rPr>
           <w:rFonts w:ascii="Arial" w:cs="Arial" w:eastAsia="Arial" w:hAnsi="Arial"/>
         </w:rPr>
-        <w:t xml:space="preserve">The fact that the Deployment 106 is shown in FIG. 1 is not to be construed as a limitation on the apparatus 100; the Deployment is shown for context only, and the apparatus 100 is operable against any Deployment that exposes a documented public interface.</w:t>
+        <w:t xml:space="preserve">The fact that the Deployment 106 is shown in FIG. 1 is not to be construed as a limitation on the apparatus 100; the Deployment is shown for context only, and the apparatus 100 is operable against any Deployment that exposes a documented input interface.</w:t>
       </w:r>
     </w:p>
     <w:p>
@@ -1132,7 +1156,7 @@
         <w:rPr>
           <w:rFonts w:ascii="Arial" w:cs="Arial" w:eastAsia="Arial" w:hAnsi="Arial"/>
         </w:rPr>
-        <w:t xml:space="preserve">The Provenance Classifier 108b is configured to assign, to each substantive claim produced by the Claim Segmenter 108a, a provenance class indicating the apparent basis of the claim. In one preferred embodiment, the provenance class is drawn from a closed taxonomy comprising at least “retrieval,” “recall,” “computation,” and “synthesis.” “Retrieval” designates claims that purport to be supported by a cited or retrievable source. “Recall” designates claims that purport to be drawn from the Deployment’s training distribution without explicit citation. “Computation” designates claims that purport to be derived by arithmetic, logical, or programmatic computation. “Synthesis” designates claims that purport to combine multiple sources or that derive a new conclusion from prior claims.</w:t>
+        <w:t xml:space="preserve">The Provenance Classifier 108b is configured to assign, to each substantive claim produced by the Claim Segmenter 108a, a provenance class indicating the apparent basis of the claim. In one preferred embodiment, the provenance class is drawn from a predefined taxonomy including at least “retrieval,” “recall,” “computation,” and “synthesis.” “Retrieval” designates claims that purport to be supported by a cited or retrievable source. “Recall” designates claims that purport to be drawn from the Deployment’s training distribution without explicit citation. “Computation” designates claims that purport to be derived by arithmetic, logical, or programmatic computation. “Synthesis” designates claims that purport to combine multiple sources or that derive a new conclusion from prior claims.</w:t>
       </w:r>
     </w:p>
     <w:p>
@@ -1388,7 +1412,7 @@
         <w:rPr>
           <w:rFonts w:ascii="Arial" w:cs="Arial" w:eastAsia="Arial" w:hAnsi="Arial"/>
         </w:rPr>
-        <w:t xml:space="preserve">The Status Matrix Marker 112d is configured to assign to each principle in the principle index a status drawn from a closed taxonomy comprising at least “Instrumented,” “Deferred,” and “Paper-Level-Only.” A principle marked “Instrumented” is one for which the apparatus 100 produces a quantitative metric on the present evaluation run. A principle marked “Deferred” is one for which the apparatus 100 records partial signals incidental to other instrumented principles but does not produce a first-class quantitative metric. A principle marked “Paper-Level-Only” is one for which the apparatus 100 reports a qualitative assessment without producing a quantitative metric.</w:t>
+        <w:t xml:space="preserve">The Status Matrix Marker 112d is configured to assign to each principle in the principle index a status drawn from a predefined taxonomy including at least “Instrumented,” “Deferred,” and “Paper-Level-Only.” A principle marked “Instrumented” is one for which the apparatus 100 produces a quantitative metric on the present evaluation run. A principle marked “Deferred” is one for which the apparatus 100 records partial signals incidental to other instrumented principles but does not produce a first-class quantitative metric. A principle marked “Paper-Level-Only” is one for which the apparatus 100 reports a qualitative assessment without producing a quantitative metric.</w:t>
       </w:r>
     </w:p>
     <w:p>
@@ -1502,7 +1526,7 @@
         <w:rPr>
           <w:rFonts w:ascii="Arial" w:cs="Arial" w:eastAsia="Arial" w:hAnsi="Arial"/>
         </w:rPr>
-        <w:t xml:space="preserve">Referring now to FIG. 4, a method according to one embodiment of the present invention comprises steps S1 through S8 performed across the components of the apparatus 100. In step S1, the Prompt Set Module 102 provides a prompt record 202 to the Evaluator-Side Proxy 104. In step S2, the Evaluator-Side Proxy 104 issues a serialized prompt 204 to the Deployment Under Evaluation 106 across the apparatus boundary 101 via the Deployment’s public interface. In step S3, the Evaluator-Side Proxy 104 receives a verbatim response 206 from the Deployment 106 across the apparatus boundary 101. In step S4, the Evaluator-Side Proxy 104 assembles the prompt and the verbatim response into a capture record 208 and passes the capture record to the Tagger 108.</w:t>
+        <w:t xml:space="preserve">Referring now to FIG. 4, a method according to one embodiment of the present invention comprises steps S1 through S8 performed across the components of the apparatus 100. In step S1, the Prompt Set Module 102 provides a prompt record 202 to the Evaluator-Side Proxy 104. In step S2, the Evaluator-Side Proxy 104 issues a serialized prompt 204 to the Deployment Under Evaluation 106 across the apparatus boundary 101 via the Deployment’s documented input interface. In step S3, the Evaluator-Side Proxy 104 receives a verbatim response 206 from the Deployment 106 across the apparatus boundary 101. In step S4, the Evaluator-Side Proxy 104 assembles the prompt and the verbatim response into a capture record 208 and passes the capture record to the Tagger 108.</w:t>
       </w:r>
     </w:p>
     <w:p>
@@ -1562,7 +1586,7 @@
         <w:rPr>
           <w:rFonts w:ascii="Arial" w:cs="Arial" w:eastAsia="Arial" w:hAnsi="Arial"/>
         </w:rPr>
-        <w:t xml:space="preserve">Throughout steps S1 through S8, the Deployment Under Evaluation 106 is not modified, instrumented, or otherwise altered, and the apparatus 100 does not require, receive, or consume any non-public state of the Deployment 106. The Deployment 106 contributes only verbatim responses 206 via its public interface in response to serialized prompts 204.</w:t>
+        <w:t xml:space="preserve">Throughout steps S1 through S8, the Deployment Under Evaluation 106 is not modified, instrumented, or otherwise altered, and the apparatus 100 does not require, receive, or consume any non-public state of the Deployment 106. The Deployment 106 contributes only verbatim responses 206 via its documented input interface in response to serialized prompts 204.</w:t>
       </w:r>
     </w:p>
     <w:p>
@@ -1692,7 +1716,7 @@
         <w:rPr>
           <w:rFonts w:ascii="Arial" w:cs="Arial" w:eastAsia="Arial" w:hAnsi="Arial"/>
         </w:rPr>
-        <w:t xml:space="preserve">In a third preferred embodiment, the apparatus 100 is operated as a service to produce Traceability Evaluation Reports 116 against third-party Deployments 106. In this embodiment, the operator of the apparatus 100 enters into a paid or non-profit relationship with a customer that owns or operates the third-party Deployment 106; the Prompt Set Module 102 is configured against the third-party Deployment’s documented use cases and claim surface; and the Traceability Evaluation Report 116 is delivered to the customer. The apparatus 100 in this embodiment performs the entire evaluation across the public interface of the third-party Deployment 106 without instrumentation of, modification to, or cooperation from that Deployment beyond ordinary acceptance of public-interface traffic; this property may be relied upon by the customer to obtain an evaluation that is structurally independent of the third-party Deployment’s own operator.</w:t>
+        <w:t xml:space="preserve">In a third preferred embodiment, the apparatus 100 is operated as a service to produce Traceability Evaluation Reports 116 against third-party Deployments 106. In this embodiment, the operator of the apparatus 100 enters into a paid or non-profit relationship with a customer that owns or operates the third-party Deployment 106; the Prompt Set Module 102 is configured against the third-party Deployment’s documented use cases and claim surface; and the Traceability Evaluation Report 116 is delivered to the customer. The apparatus 100 in this embodiment performs the entire evaluation across the documented input interface of the third-party Deployment 106 without instrumentation of, modification to, or cooperation from that Deployment beyond ordinary processing of traffic through the documented input interface; this property may be relied upon by the customer to obtain an evaluation that is structurally independent of the third-party Deployment’s own operator.</w:t>
       </w:r>
     </w:p>
     <w:p>
@@ -1748,7 +1772,7 @@
         <w:rPr>
           <w:rFonts w:ascii="Arial" w:cs="Arial" w:eastAsia="Arial" w:hAnsi="Arial"/>
         </w:rPr>
-        <w:t xml:space="preserve">The Deployment Under Evaluation 106 may be any deployed AI system exposing a public interface, including without limitation a large language model, a retrieval-augmented generation system, a multimodal generative system, a programmatic agent, a voice assistant, or any combination of the foregoing. The public interface may be of any documented form.</w:t>
+        <w:t xml:space="preserve">The Deployment Under Evaluation 106 may be any deployed AI system exposing a documented input interface for ordinary user or customer requests, including without limitation a large language model, a retrieval-augmented generation system, a multimodal generative system, a programmatic agent, a voice assistant, or any combination of the foregoing. The documented input interface may be of any documented form, including a public, authenticated, rate-limited, customer-authorized, or otherwise ordinary input channel that does not expose non-public internal state.</w:t>
       </w:r>
     </w:p>
     <w:p>
@@ -1804,7 +1828,7 @@
         <w:rPr>
           <w:rFonts w:ascii="Arial" w:cs="Arial" w:eastAsia="Arial" w:hAnsi="Arial"/>
         </w:rPr>
-        <w:t xml:space="preserve">For the purposes of the present specification and the appended claims, the following definitions apply. A “Deployment Under Evaluation” or “Deployment” is a deployed artificial-intelligence system that exposes one or more documented public interfaces by which it accepts input and returns output. A “verbatim response” is a response from the Deployment that has not been modified, summarized, normalized, or otherwise transformed by the apparatus. A “substantive claim” is a span of a verbatim response that asserts, denies, or qualifies a fact, recommendation, prediction, or other assertion subject to evidentiary evaluation. A “public interface” is any documented interface by which the Deployment ordinarily accepts public input, including without limitation an HTTP API, an RPC interface, a WebSocket channel, or a web-form interface. An “invariant output schema” is a schema whose field names, field types, ordering, and required-versus-optional designation do not vary as a function of which implementation strategy is selected for upstream sub-components. “Claim discipline” refers collectively to the observable behavior of the Deployment with respect to provenance of claims, uncertainty disclosure, refusal of out-of-scope requests, and preservation of an audit trail.</w:t>
+        <w:t xml:space="preserve">For the purposes of the present specification and the appended claims, the following definitions apply. A “Deployment Under Evaluation” or “Deployment” is a deployed artificial-intelligence system that exposes one or more documented input interfaces by which it accepts input and returns output. A “verbatim response” is a response from the Deployment that has not been modified, summarized, normalized, or otherwise transformed by the apparatus. A “substantive claim” is a span of a verbatim response that asserts, denies, or qualifies a fact, recommendation, prediction, or other assertion subject to evidentiary evaluation. A “documented input interface” is any documented interface by which the Deployment ordinarily accepts input without exposing non-public internal state, including without limitation an HTTP API, an RPC interface, a WebSocket channel, a web-form interface, an authenticated customer interface, or a rate-limited documented input interface. An “invariant output schema” is a schema whose field names, field types, ordering, and required-versus-optional designation do not vary as a function of which implementation strategy is selected for upstream sub-components. “Claim discipline” refers collectively to the observable behavior of the Deployment with respect to provenance of claims, uncertainty disclosure, refusal of out-of-scope requests, and preservation of an audit trail.</w:t>
       </w:r>
     </w:p>
     <w:p>
@@ -1866,7 +1890,7 @@
         <w:rPr>
           <w:rFonts w:ascii="Arial" w:cs="Arial" w:eastAsia="Arial" w:hAnsi="Arial"/>
         </w:rPr>
-        <w:t xml:space="preserve">An apparatus for evaluating a deployed artificial-intelligence system, the apparatus comprising: a prompt set module configured to provide a prompt record; an evaluator-side proxy operatively coupled to the prompt set module and configured to (i) issue a serialized prompt to the deployed artificial-intelligence system across an apparatus boundary by way of a public interface of the deployed artificial-intelligence system, and (ii) receive a verbatim response from the deployed artificial-intelligence system across the apparatus boundary, wherein the deployed artificial-intelligence system is disposed external to the apparatus boundary; a tagger operatively coupled to the evaluator-side proxy and configured to decompose the verbatim response into one or more per-claim records and to apply to each per-claim record an invariant marker schema comprising at least a provenance classification, an uncertainty marker, and a refusal classification, the tagger thereby producing a tagged interaction record; an audit store operatively coupled to the tagger and configured to persist the tagged interaction record indexed by an evaluation run identifier; a scoring module operatively coupled to the audit store and configured to (i) query the audit store by the evaluation run identifier to obtain a record set and (ii) reduce the record set to a principle-indexed metric set bearing a status matrix marking each principle in a principle index with one of an instrumented status, a deferred status, and a paper-level-only status; and a report renderer operatively coupled to the scoring module and configured to emit a traceability evaluation report from the principle-indexed metric set; wherein the apparatus is configured to perform the foregoing without instrumentation of, modification to, or cooperation from the deployed artificial-intelligence system beyond ordinary acceptance of public-interface traffic.</w:t>
+        <w:t xml:space="preserve">An apparatus for evaluating a deployed artificial-intelligence system, the apparatus comprising: a prompt set module configured to provide a prompt record; an evaluator-side proxy operatively coupled to the prompt set module and configured to (i) issue a serialized prompt to the deployed artificial-intelligence system across an apparatus boundary by way of a documented input interface of the deployed artificial-intelligence system, and (ii) receive a verbatim response from the deployed artificial-intelligence system across the apparatus boundary, wherein the deployed artificial-intelligence system is disposed external to the apparatus boundary; a tagger operatively coupled to the evaluator-side proxy and configured to decompose the verbatim response into one or more per-claim records and to apply to each per-claim record an invariant marker schema comprising at least a provenance classification, an uncertainty marker, and a refusal classification, the tagger thereby producing a tagged interaction record; an audit store operatively coupled to the tagger and configured to persist the tagged interaction record indexed by an evaluation run identifier; a scoring module operatively coupled to the audit store and configured to (i) query the audit store by the evaluation run identifier to obtain a record set and (ii) reduce the record set to a principle-indexed metric set bearing a status matrix marking each principle in a principle index with one of an instrumented status, a deferred status, and a paper-level-only status; and a report renderer operatively coupled to the scoring module and configured to emit a traceability evaluation report from the principle-indexed metric set; wherein the apparatus is configured to perform the foregoing without instrumentation or modification of the deployed artificial-intelligence system, without access to non-public internal state of the deployed artificial-intelligence system, and without operator cooperation beyond ordinary processing of traffic through the documented input interface.</w:t>
       </w:r>
     </w:p>
     <w:p>
@@ -1887,7 +1911,7 @@
         <w:rPr>
           <w:rFonts w:ascii="Arial" w:cs="Arial" w:eastAsia="Arial" w:hAnsi="Arial"/>
         </w:rPr>
-        <w:t xml:space="preserve">The apparatus of claim 1, wherein the prompt set module is configured to label each prompt record with a category drawn from a closed taxonomy comprising at least answerable, ambiguous, out-of-corpus, adversarial, and citation-trap categories.</w:t>
+        <w:t xml:space="preserve">The apparatus of claim 1, wherein the prompt set module is configured to label each prompt record with a category drawn from a predefined taxonomy including at least answerable, ambiguous, out-of-corpus, adversarial, and citation-trap categories.</w:t>
       </w:r>
     </w:p>
     <w:p>
@@ -1929,7 +1953,7 @@
         <w:rPr>
           <w:rFonts w:ascii="Arial" w:cs="Arial" w:eastAsia="Arial" w:hAnsi="Arial"/>
         </w:rPr>
-        <w:t xml:space="preserve">The apparatus of claim 1, wherein the tagger comprises: a claim segmenter configured to decompose the verbatim response into the one or more per-claim records; a provenance classifier configured to assign to each per-claim record a provenance class drawn from a closed taxonomy comprising at least a retrieval class, a recall class, a computation class, and a synthesis class; an uncertainty marker extractor configured to identify within each per-claim record one or more uncertainty markers; a refusal classifier configured to assign to a per-claim record a refusal class drawn from a closed taxonomy comprising at least an explicit-and-reasoned class, an evasive class, and a strategic-non-refusal class; and a schema emitter configured to assemble outputs of the claim segmenter, the provenance classifier, the uncertainty marker extractor, and the refusal classifier into the tagged interaction record according to a published, invariant output schema.</w:t>
+        <w:t xml:space="preserve">The apparatus of claim 1, wherein the tagger comprises: a claim segmenter configured to decompose the verbatim response into the one or more per-claim records; a provenance classifier configured to assign to each per-claim record a provenance class drawn from a predefined taxonomy including at least a retrieval class, a recall class, a computation class, and a synthesis class; an uncertainty marker extractor configured to identify within each per-claim record one or more uncertainty markers; a refusal classifier configured to assign to at least one of a per-claim record and an associated response-level record a refusal class drawn from a predefined taxonomy including at least an explicit-and-reasoned class, an evasive class, and a strategic-non-refusal class; and a schema emitter configured to assemble outputs of the claim segmenter, the provenance classifier, the uncertainty marker extractor, and the refusal classifier into the tagged interaction record according to a published, invariant output schema.</w:t>
       </w:r>
     </w:p>
     <w:p>
@@ -1992,7 +2016,7 @@
         <w:rPr>
           <w:rFonts w:ascii="Arial" w:cs="Arial" w:eastAsia="Arial" w:hAnsi="Arial"/>
         </w:rPr>
-        <w:t xml:space="preserve">The apparatus of claim 1, wherein the scoring module comprises: a record set selector configured to filter the record set by the evaluation run identifier; a principle index mapper configured to associate each tagged interaction record with one or more entries of a publicly defined principle index; a metric reducer configured to compute, for each principle in the principle index, at least one metric by reduction over the filtered record set; and a status matrix marker configured to assign to each principle in the principle index a status drawn from a closed taxonomy comprising at least the instrumented status, the deferred status, and the paper-level-only status.</w:t>
+        <w:t xml:space="preserve">The apparatus of claim 1, wherein the scoring module comprises: a record set selector configured to filter the record set by the evaluation run identifier; a principle index mapper configured to associate each tagged interaction record with one or more entries of a publicly defined principle index; a metric reducer configured to compute, for each principle in the principle index, at least one metric by reduction over the filtered record set; and a status matrix marker configured to assign to each principle in the principle index a status drawn from a predefined taxonomy including at least the instrumented status, the deferred status, and the paper-level-only status.</w:t>
       </w:r>
     </w:p>
     <w:p>
@@ -2013,7 +2037,7 @@
         <w:rPr>
           <w:rFonts w:ascii="Arial" w:cs="Arial" w:eastAsia="Arial" w:hAnsi="Arial"/>
         </w:rPr>
-        <w:t xml:space="preserve">The apparatus of claim 7, wherein the at least one metric computed by the metric reducer comprises one or more of: a citation resolution rate; a citation support rate; an uncertainty marker extraction rate; a refusal-rate breakdown by category; and a strategic-non-refusal rate.</w:t>
+        <w:t xml:space="preserve">The apparatus of claim 7, wherein the principle index includes one or more principles for provenance, audit trail, uncertainty disclosure, and refusal boundaries, and wherein the at least one metric computed by the metric reducer comprises one or more of: a citation resolution rate; a citation support rate; an uncertainty marker extraction rate; a refusal-rate breakdown by category; and a strategic-non-refusal rate.</w:t>
       </w:r>
     </w:p>
     <w:p>
@@ -2034,7 +2058,7 @@
         <w:rPr>
           <w:rFonts w:ascii="Arial" w:cs="Arial" w:eastAsia="Arial" w:hAnsi="Arial"/>
         </w:rPr>
-        <w:t xml:space="preserve">The apparatus of claim 1, wherein the audit store is configured to support reconstruction of an evaluation run by replay of its persisted tagged interaction records against a stated version of the deployed artificial-intelligence system.</w:t>
+        <w:t xml:space="preserve">The apparatus of claim 1, wherein the audit store is configured to support reconstruction of an evaluation run from persisted prompt records, verbatim responses, tagged interaction records, and associated run metadata, and is further configured to support repeat evaluation against a stated version of the deployed artificial-intelligence system when that stated version remains accessible through the documented input interface.</w:t>
       </w:r>
     </w:p>
     <w:p>
@@ -2076,7 +2100,7 @@
         <w:rPr>
           <w:rFonts w:ascii="Arial" w:cs="Arial" w:eastAsia="Arial" w:hAnsi="Arial"/>
         </w:rPr>
-        <w:t xml:space="preserve">A method, performed by an apparatus comprising a prompt set module, an evaluator-side proxy, a tagger, an audit store, a scoring module, and a report renderer, for evaluating a deployed artificial-intelligence system disposed external to an apparatus boundary, the method comprising the steps of: (a) providing, from the prompt set module to the evaluator-side proxy, a prompt record; (b) issuing, by the evaluator-side proxy across the apparatus boundary, a serialized prompt to the deployed artificial-intelligence system by way of a public interface of the deployed artificial-intelligence system; (c) receiving, by the evaluator-side proxy across the apparatus boundary, a verbatim response from the deployed artificial-intelligence system; (d) decomposing, by the tagger, the verbatim response into one or more per-claim records and applying to each per-claim record an invariant marker schema comprising at least a provenance classification, an uncertainty marker, and a refusal classification, thereby producing a tagged interaction record; (e) persisting, in the audit store, the tagged interaction record indexed by an evaluation run identifier; (f) querying, by the scoring module, the audit store by the evaluation run identifier to obtain a record set, and reducing the record set to a principle-indexed metric set bearing a status matrix; and (g) rendering, by the report renderer, a traceability evaluation report from the principle-indexed metric set; wherein the method is performed without instrumentation of, modification to, or cooperation from the deployed artificial-intelligence system beyond ordinary acceptance of public-interface traffic.</w:t>
+        <w:t xml:space="preserve">A method, performed by an apparatus comprising a prompt set module, an evaluator-side proxy, a tagger, an audit store, a scoring module, and a report renderer, for evaluating a deployed artificial-intelligence system disposed external to an apparatus boundary, the method comprising the steps of: (a) providing, from the prompt set module to the evaluator-side proxy, a prompt record; (b) issuing, by the evaluator-side proxy across the apparatus boundary, a serialized prompt to the deployed artificial-intelligence system by way of a documented input interface of the deployed artificial-intelligence system; (c) receiving, by the evaluator-side proxy across the apparatus boundary, a verbatim response from the deployed artificial-intelligence system; (d) decomposing, by the tagger, the verbatim response into one or more per-claim records and applying to each per-claim record or to an associated response-level record an invariant marker schema comprising at least a provenance classification, an uncertainty marker, and a refusal classification, thereby producing a tagged interaction record; (e) persisting, in the audit store, the tagged interaction record indexed by an evaluation run identifier; (f) querying, by the scoring module, the audit store by the evaluation run identifier to obtain a record set, and reducing the record set to a principle-indexed metric set bearing a status matrix; and (g) rendering, by the report renderer, a traceability evaluation report from the principle-indexed metric set; wherein the method is performed without instrumentation or modification of the deployed artificial-intelligence system, without access to non-public internal state of the deployed artificial-intelligence system, and without operator cooperation beyond ordinary processing of traffic through the documented input interface.</w:t>
       </w:r>
     </w:p>
     <w:p>
@@ -2097,7 +2121,7 @@
         <w:rPr>
           <w:rFonts w:ascii="Arial" w:cs="Arial" w:eastAsia="Arial" w:hAnsi="Arial"/>
         </w:rPr>
-        <w:t xml:space="preserve">The method of claim 11, wherein step (d) further comprises segmenting the verbatim response into substantive claims and assigning, to each substantive claim, a provenance class drawn from a closed taxonomy comprising at least a retrieval class, a recall class, a computation class, and a synthesis class.</w:t>
+        <w:t xml:space="preserve">The method of claim 11, wherein step (d) further comprises segmenting the verbatim response into substantive claims and assigning, to each substantive claim, a provenance class drawn from a predefined taxonomy including at least a retrieval class, a recall class, a computation class, and a synthesis class.</w:t>
       </w:r>
     </w:p>
     <w:p>
@@ -2118,7 +2142,7 @@
         <w:rPr>
           <w:rFonts w:ascii="Arial" w:cs="Arial" w:eastAsia="Arial" w:hAnsi="Arial"/>
         </w:rPr>
-        <w:t xml:space="preserve">The method of claim 11, wherein step (f) further comprises associating each tagged interaction record with one or more entries of a publicly defined principle index and assigning to each principle in the principle index a status drawn from a closed taxonomy comprising at least an instrumented status, a deferred status, and a paper-level-only status.</w:t>
+        <w:t xml:space="preserve">The method of claim 11, wherein step (f) further comprises associating each tagged interaction record with one or more entries of a publicly defined principle index and assigning to each principle in the principle index a status drawn from a predefined taxonomy including at least an instrumented status, a deferred status, and a paper-level-only status.</w:t>
       </w:r>
     </w:p>
     <w:p>
@@ -2160,7 +2184,7 @@
         <w:rPr>
           <w:rFonts w:ascii="Arial" w:cs="Arial" w:eastAsia="Arial" w:hAnsi="Arial"/>
         </w:rPr>
-        <w:t xml:space="preserve">A non-transitory computer-readable medium storing instructions which, when executed by one or more processors of an apparatus comprising a prompt set module, an evaluator-side proxy, a tagger, an audit store, a scoring module, and a report renderer, cause the apparatus to perform the method of claim 11.</w:t>
+        <w:t xml:space="preserve">A non-transitory computer-readable medium storing instructions which, when executed by one or more processors, cause an apparatus to: provide, from a prompt set module to an evaluator-side proxy, a prompt record; issue, by the evaluator-side proxy across an apparatus boundary, a serialized prompt to a deployed artificial-intelligence system disposed external to the apparatus boundary by way of a documented input interface; receive, by the evaluator-side proxy across the apparatus boundary, a verbatim response from the deployed artificial-intelligence system; decompose, by a tagger, the verbatim response into one or more per-claim records and apply to each per-claim record or to an associated response-level record an invariant marker schema comprising at least a provenance classification, an uncertainty marker, and a refusal classification, thereby producing a tagged interaction record; persist, in an audit store, the tagged interaction record indexed by an evaluation run identifier; query, by a scoring module, the audit store by the evaluation run identifier to obtain a record set and reduce the record set to a principle-indexed metric set bearing a status matrix; and render, by a report renderer, a traceability evaluation report from the principle-indexed metric set; wherein the operations are performed without instrumentation or modification of the deployed artificial-intelligence system, without access to non-public internal state of the deployed artificial-intelligence system, and without operator cooperation beyond ordinary processing of traffic through the documented input interface.</w:t>
       </w:r>
     </w:p>
     <w:p>
@@ -2193,7 +2217,7 @@
         <w:rPr>
           <w:rFonts w:ascii="Arial" w:cs="Arial" w:eastAsia="Arial" w:hAnsi="Arial"/>
         </w:rPr>
-        <w:t xml:space="preserve">Disclosed are an apparatus and a method for evaluating a deployed artificial-intelligence system through an evaluator-side proxy that operates exclusively against the system’s public interface. The apparatus comprises a prompt set module, an evaluator-side proxy, a tagger, an audit store, a scoring module, and a report renderer, enclosed by an apparatus boundary. The deployment under evaluation is disposed external to the apparatus boundary and is not instrumented, modified, or otherwise required to cooperate. The tagger decomposes captured verbatim responses into per-claim records under an invariant marker schema that records provenance, uncertainty, and refusal markers. The scoring module reduces stored records to a principle-indexed metric set bearing a status matrix, and the report renderer emits a structured Traceability Evaluation Report comparable across distinct deployments evaluated against the same principle index.</w:t>
+        <w:t xml:space="preserve">Disclosed are an apparatus and a method for evaluating a deployed artificial-intelligence system through an evaluator-side proxy that operates against the system’s documented input interface. The apparatus comprises a prompt set module, an evaluator-side proxy, a tagger, an audit store, a scoring module, and a report renderer, enclosed by an apparatus boundary. The deployment under evaluation is disposed external to the apparatus boundary and is not instrumented or modified, and no non-public internal deployment state is required. The tagger decomposes captured verbatim responses into per-claim records under an invariant marker schema that records provenance, uncertainty, and refusal markers. The scoring module reduces stored records to a principle-indexed metric set bearing a status matrix, and the report renderer emits a structured Traceability Evaluation Report comparable across distinct deployments evaluated against the same principle index.</w:t>
       </w:r>
     </w:p>
     <w:p>
@@ -2250,7 +2274,7 @@
         <w:rPr>
           <w:rFonts w:ascii="Arial" w:cs="Arial" w:eastAsia="Arial" w:hAnsi="Arial"/>
         </w:rPr>
-        <w:t xml:space="preserve">Claim shape: claims 1, 11, and 15 are drafted as independent claims (apparatus, method, and computer-readable medium respectively); claims 2–10 and 12–14 are drafted as dependent claims. Counsel may wish to restructure with the apparatus claim as primary and the method claim as separately presented under any restriction-requirement strategy.</w:t>
+        <w:t xml:space="preserve">Claim shape: claims 1, 11, and 15 are drafted as parallel apparatus, method, and computer-readable-medium claim forms; claim 15 recites operations directly rather than merely referring to claim 11 so the software-storage embodiment has standalone support. Claims 2–10 and 12–14 are drafted as dependent claims. Counsel may wish to restructure with the apparatus claim as primary and the method claim as separately presented under any restriction-requirement strategy.</w:t>
       </w:r>
     </w:p>
     <w:p>
@@ -2266,7 +2290,7 @@
         <w:rPr>
           <w:rFonts w:ascii="Arial" w:cs="Arial" w:eastAsia="Arial" w:hAnsi="Arial"/>
         </w:rPr>
-        <w:t xml:space="preserve">Schema specificity: claim 5 recites schema invariance. Counsel should evaluate the appropriate level of abstraction; too concrete invites design-around, too abstract invites § 101 abstract-idea rejection.</w:t>
+        <w:t xml:space="preserve">Schema specificity: claim 5 recites schema invariance, while the taxonomy claims now use predefined open-ended representative classes rather than strictly closed lists. Counsel should evaluate the appropriate level of abstraction; too concrete invites design-around, too abstract invites § 101 abstract-idea rejection.</w:t>
       </w:r>
     </w:p>
     <w:p>
@@ -2282,7 +2306,7 @@
         <w:rPr>
           <w:rFonts w:ascii="Arial" w:cs="Arial" w:eastAsia="Arial" w:hAnsi="Arial"/>
         </w:rPr>
-        <w:t xml:space="preserve">Public-interface limitation: the recitation that the apparatus operates without instrumentation, modification, or cooperation appears in claim 1 (apparatus) and claim 11 (method). Counsel may wish to consider whether this limitation should be elevated to a separate independent claim or restated in language that more clearly distinguishes the apparatus from ordinary API consumption.</w:t>
+        <w:t xml:space="preserve">Documented-interface / no-internal-state limitation: the recitation that the apparatus operates without instrumentation, modification, non-public internal-state access, or operator cooperation beyond ordinary documented-interface traffic appears in claims 1, 11, and 15. Counsel may wish to consider whether this limitation should be split into a separate independent claim or restated in language that more clearly distinguishes the apparatus from ordinary API consumption without excluding authenticated partner evaluations.</w:t>
       </w:r>
     </w:p>
     <w:p>
@@ -2361,11 +2385,7 @@
 </w:document>
 </file>
 
-<file path=word/comments.xml><?xml version="1.0" encoding="utf-8"?>
-<w:comments xmlns:cx="http://schemas.microsoft.com/office/drawing/2014/chartex" xmlns:cx1="http://schemas.microsoft.com/office/drawing/2015/9/8/chartex" xmlns:cx2="http://schemas.microsoft.com/office/drawing/2015/10/21/chartex" xmlns:cx3="http://schemas.microsoft.com/office/drawing/2016/5/9/chartex" xmlns:cx4="http://schemas.microsoft.com/office/drawing/2016/5/10/chartex" xmlns:cx5="http://schemas.microsoft.com/office/drawing/2016/5/11/chartex" xmlns:cx6="http://schemas.microsoft.com/office/drawing/2016/5/12/chartex" xmlns:cx7="http://schemas.microsoft.com/office/drawing/2016/5/13/chartex" xmlns:cx8="http://schemas.microsoft.com/office/drawing/2016/5/14/chartex" xmlns:mc="http://schemas.openxmlformats.org/markup-compatibility/2006" xmlns:aink="http://schemas.microsoft.com/office/drawing/2016/ink" xmlns:am3d="http://schemas.microsoft.com/office/drawing/2017/model3d" xmlns:o="urn:schemas-microsoft-com:office:office" xmlns:r="http://schemas.openxmlformats.org/officeDocument/2006/relationships" xmlns:m="http://schemas.openxmlformats.org/officeDocument/2006/math" xmlns:v="urn:schemas-microsoft-com:vml" xmlns:wp14="http://schemas.microsoft.com/office/word/2010/wordprocessingDrawing" xmlns:wp="http://schemas.openxmlformats.org/drawingml/2006/wordprocessingDrawing" xmlns:w10="urn:schemas-microsoft-com:office:word" xmlns:w="http://schemas.openxmlformats.org/wordprocessingml/2006/main" xmlns:w14="http://schemas.microsoft.com/office/word/2010/wordml" xmlns:w15="http://schemas.microsoft.com/office/word/2012/wordml" xmlns:w16cex="http://schemas.microsoft.com/office/word/2018/wordml/cex" xmlns:w16cid="http://schemas.microsoft.com/office/word/2016/wordml/cid" xmlns:w16="http://schemas.microsoft.com/office/word/2018/wordml" xmlns:w16sdtdh="http://schemas.microsoft.com/office/word/2020/wordml/sdtdatahash" xmlns:w16se="http://schemas.microsoft.com/office/word/2015/wordml/symex" xmlns:wpg="http://schemas.microsoft.com/office/word/2010/wordprocessingGroup" xmlns:wpi="http://schemas.microsoft.com/office/word/2010/wordprocessingInk" xmlns:wne="http://schemas.microsoft.com/office/word/2006/wordml" xmlns:wps="http://schemas.microsoft.com/office/word/2010/wordprocessingShape"/>
-</file>
-
-<file path=word/endnotes.xml><?xml version="1.0" encoding="utf-8"?>
+<file path=word\endnotes.xml><?xml version="1.0" encoding="utf-8"?>
 <w:endnotes xmlns:wpc="http://schemas.microsoft.com/office/word/2010/wordprocessingCanvas" xmlns:mc="http://schemas.openxmlformats.org/markup-compatibility/2006" xmlns:o="urn:schemas-microsoft-com:office:office" xmlns:r="http://schemas.openxmlformats.org/officeDocument/2006/relationships" xmlns:m="http://schemas.openxmlformats.org/officeDocument/2006/math" xmlns:v="urn:schemas-microsoft-com:vml" xmlns:wp14="http://schemas.microsoft.com/office/word/2010/wordprocessingDrawing" xmlns:wp="http://schemas.openxmlformats.org/drawingml/2006/wordprocessingDrawing" xmlns:w10="urn:schemas-microsoft-com:office:word" xmlns:w="http://schemas.openxmlformats.org/wordprocessingml/2006/main" xmlns:w14="http://schemas.microsoft.com/office/word/2010/wordml" xmlns:w15="http://schemas.microsoft.com/office/word/2012/wordml" xmlns:wpg="http://schemas.microsoft.com/office/word/2010/wordprocessingGroup" xmlns:wpi="http://schemas.microsoft.com/office/word/2010/wordprocessingInk" xmlns:wne="http://schemas.microsoft.com/office/word/2006/wordml" xmlns:wps="http://schemas.microsoft.com/office/word/2010/wordprocessingShape" mc:Ignorable="w14 w15 wp14">
   <w:endnote w:type="separator" w:id="-1">
     <w:p>
@@ -2402,7 +2422,11 @@
 </w:endnotes>
 </file>
 
-<file path=word/footer1.xml><?xml version="1.0" encoding="utf-8"?>
+<file path=word\fontTable.xml><?xml version="1.0" encoding="utf-8"?>
+<w:fonts xmlns:mc="http://schemas.openxmlformats.org/markup-compatibility/2006" xmlns:r="http://schemas.openxmlformats.org/officeDocument/2006/relationships" xmlns:w="http://schemas.openxmlformats.org/wordprocessingml/2006/main" xmlns:w14="http://schemas.microsoft.com/office/word/2010/wordml" xmlns:w15="http://schemas.microsoft.com/office/word/2012/wordml" xmlns:w16cex="http://schemas.microsoft.com/office/word/2018/wordml/cex" xmlns:w16cid="http://schemas.microsoft.com/office/word/2016/wordml/cid" xmlns:w16="http://schemas.microsoft.com/office/word/2018/wordml" xmlns:w16sdtdh="http://schemas.microsoft.com/office/word/2020/wordml/sdtdatahash" xmlns:w16se="http://schemas.microsoft.com/office/word/2015/wordml/symex" mc:Ignorable="w14 w15 w16se w16cid w16 w16cex w16sdtdh"/>
+</file>
+
+<file path=word\footer1.xml><?xml version="1.0" encoding="utf-8"?>
 <w:ftr xmlns:wpc="http://schemas.microsoft.com/office/word/2010/wordprocessingCanvas" xmlns:mc="http://schemas.openxmlformats.org/markup-compatibility/2006" xmlns:o="urn:schemas-microsoft-com:office:office" xmlns:r="http://schemas.openxmlformats.org/officeDocument/2006/relationships" xmlns:m="http://schemas.openxmlformats.org/officeDocument/2006/math" xmlns:v="urn:schemas-microsoft-com:vml" xmlns:wp14="http://schemas.microsoft.com/office/word/2010/wordprocessingDrawing" xmlns:wp="http://schemas.openxmlformats.org/drawingml/2006/wordprocessingDrawing" xmlns:w10="urn:schemas-microsoft-com:office:word" xmlns:w="http://schemas.openxmlformats.org/wordprocessingml/2006/main" xmlns:w14="http://schemas.microsoft.com/office/word/2010/wordml" xmlns:w15="http://schemas.microsoft.com/office/word/2012/wordml" xmlns:wpg="http://schemas.microsoft.com/office/word/2010/wordprocessingGroup" xmlns:wpi="http://schemas.microsoft.com/office/word/2010/wordprocessingInk" xmlns:wne="http://schemas.microsoft.com/office/word/2006/wordml" xmlns:wps="http://schemas.microsoft.com/office/word/2010/wordprocessingShape">
   <w:p>
     <w:pPr>
@@ -2468,7 +2492,7 @@
 </w:ftr>
 </file>
 
-<file path=word/footnotes.xml><?xml version="1.0" encoding="utf-8"?>
+<file path=word\footnotes.xml><?xml version="1.0" encoding="utf-8"?>
 <w:footnotes xmlns:wpc="http://schemas.microsoft.com/office/word/2010/wordprocessingCanvas" xmlns:mc="http://schemas.openxmlformats.org/markup-compatibility/2006" xmlns:o="urn:schemas-microsoft-com:office:office" xmlns:r="http://schemas.openxmlformats.org/officeDocument/2006/relationships" xmlns:m="http://schemas.openxmlformats.org/officeDocument/2006/math" xmlns:v="urn:schemas-microsoft-com:vml" xmlns:wp14="http://schemas.microsoft.com/office/word/2010/wordprocessingDrawing" xmlns:wp="http://schemas.openxmlformats.org/drawingml/2006/wordprocessingDrawing" xmlns:w10="urn:schemas-microsoft-com:office:word" xmlns:w="http://schemas.openxmlformats.org/wordprocessingml/2006/main" xmlns:w14="http://schemas.microsoft.com/office/word/2010/wordml" xmlns:w15="http://schemas.microsoft.com/office/word/2012/wordml" xmlns:wpg="http://schemas.microsoft.com/office/word/2010/wordprocessingGroup" xmlns:wpi="http://schemas.microsoft.com/office/word/2010/wordprocessingInk" xmlns:wne="http://schemas.microsoft.com/office/word/2006/wordml" xmlns:wps="http://schemas.microsoft.com/office/word/2010/wordprocessingShape" mc:Ignorable="w14 w15 wp14">
   <w:footnote w:type="separator" w:id="-1">
     <w:p>
@@ -2505,7 +2529,7 @@
 </w:footnotes>
 </file>
 
-<file path=word/header1.xml><?xml version="1.0" encoding="utf-8"?>
+<file path=word\header1.xml><?xml version="1.0" encoding="utf-8"?>
 <w:hdr xmlns:wpc="http://schemas.microsoft.com/office/word/2010/wordprocessingCanvas" xmlns:mc="http://schemas.openxmlformats.org/markup-compatibility/2006" xmlns:o="urn:schemas-microsoft-com:office:office" xmlns:r="http://schemas.openxmlformats.org/officeDocument/2006/relationships" xmlns:m="http://schemas.openxmlformats.org/officeDocument/2006/math" xmlns:v="urn:schemas-microsoft-com:vml" xmlns:wp14="http://schemas.microsoft.com/office/word/2010/wordprocessingDrawing" xmlns:wp="http://schemas.openxmlformats.org/drawingml/2006/wordprocessingDrawing" xmlns:w10="urn:schemas-microsoft-com:office:word" xmlns:w="http://schemas.openxmlformats.org/wordprocessingml/2006/main" xmlns:w14="http://schemas.microsoft.com/office/word/2010/wordml" xmlns:w15="http://schemas.microsoft.com/office/word/2012/wordml" xmlns:wpg="http://schemas.microsoft.com/office/word/2010/wordprocessingGroup" xmlns:wpi="http://schemas.microsoft.com/office/word/2010/wordprocessingInk" xmlns:wne="http://schemas.microsoft.com/office/word/2006/wordml" xmlns:wps="http://schemas.microsoft.com/office/word/2010/wordprocessingShape" xmlns:cx="http://schemas.microsoft.com/office/drawing/2014/chartex" xmlns:cx1="http://schemas.microsoft.com/office/drawing/2015/9/8/chartex" xmlns:cx2="http://schemas.microsoft.com/office/drawing/2015/10/21/chartex" xmlns:cx3="http://schemas.microsoft.com/office/drawing/2016/5/9/chartex" xmlns:cx4="http://schemas.microsoft.com/office/drawing/2016/5/10/chartex" xmlns:cx5="http://schemas.microsoft.com/office/drawing/2016/5/11/chartex" xmlns:cx6="http://schemas.microsoft.com/office/drawing/2016/5/12/chartex" xmlns:cx7="http://schemas.microsoft.com/office/drawing/2016/5/13/chartex" xmlns:cx8="http://schemas.microsoft.com/office/drawing/2016/5/14/chartex" xmlns:w16cid="http://schemas.microsoft.com/office/word/2016/wordml/cid" xmlns:w16se="http://schemas.microsoft.com/office/word/2015/wordml/symex">
   <w:p>
     <w:pPr>
@@ -2525,7 +2549,7 @@
 </w:hdr>
 </file>
 
-<file path=word/numbering.xml><?xml version="1.0" encoding="utf-8"?>
+<file path=word\numbering.xml><?xml version="1.0" encoding="utf-8"?>
 <w:numbering xmlns:wpc="http://schemas.microsoft.com/office/word/2010/wordprocessingCanvas" xmlns:mc="http://schemas.openxmlformats.org/markup-compatibility/2006" xmlns:o="urn:schemas-microsoft-com:office:office" xmlns:r="http://schemas.openxmlformats.org/officeDocument/2006/relationships" xmlns:m="http://schemas.openxmlformats.org/officeDocument/2006/math" xmlns:v="urn:schemas-microsoft-com:vml" xmlns:wp14="http://schemas.microsoft.com/office/word/2010/wordprocessingDrawing" xmlns:wp="http://schemas.openxmlformats.org/drawingml/2006/wordprocessingDrawing" xmlns:w10="urn:schemas-microsoft-com:office:word" xmlns:w="http://schemas.openxmlformats.org/wordprocessingml/2006/main" xmlns:w14="http://schemas.microsoft.com/office/word/2010/wordml" xmlns:w15="http://schemas.microsoft.com/office/word/2012/wordml" xmlns:wpg="http://schemas.microsoft.com/office/word/2010/wordprocessingGroup" xmlns:wpi="http://schemas.microsoft.com/office/word/2010/wordprocessingInk" xmlns:wne="http://schemas.microsoft.com/office/word/2006/wordml" xmlns:wps="http://schemas.microsoft.com/office/word/2010/wordprocessingShape" mc:Ignorable="w14 w15 wp14">
   <w:abstractNum w:abstractNumId="1" w15:restartNumberingAfterBreak="0">
     <w:multiLevelType w:val="hybridMultilevel"/>
@@ -2638,7 +2662,17 @@
 </w:numbering>
 </file>
 
-<file path=word/styles.xml><?xml version="1.0" encoding="utf-8"?>
+<file path=word\settings.xml><?xml version="1.0" encoding="utf-8"?>
+<w:settings xmlns:wpc="http://schemas.microsoft.com/office/word/2010/wordprocessingCanvas" xmlns:mc="http://schemas.openxmlformats.org/markup-compatibility/2006" xmlns:o="urn:schemas-microsoft-com:office:office" xmlns:r="http://schemas.openxmlformats.org/officeDocument/2006/relationships" xmlns:m="http://schemas.openxmlformats.org/officeDocument/2006/math" xmlns:v="urn:schemas-microsoft-com:vml" xmlns:wp14="http://schemas.microsoft.com/office/word/2010/wordprocessingDrawing" xmlns:wp="http://schemas.openxmlformats.org/drawingml/2006/wordprocessingDrawing" xmlns:w10="urn:schemas-microsoft-com:office:word" xmlns:w="http://schemas.openxmlformats.org/wordprocessingml/2006/main" xmlns:w14="http://schemas.microsoft.com/office/word/2010/wordml" xmlns:w15="http://schemas.microsoft.com/office/word/2012/wordml" xmlns:wpg="http://schemas.microsoft.com/office/word/2010/wordprocessingGroup" xmlns:wpi="http://schemas.microsoft.com/office/word/2010/wordprocessingInk" xmlns:wne="http://schemas.microsoft.com/office/word/2006/wordml" xmlns:wps="http://schemas.microsoft.com/office/word/2010/wordprocessingShape" mc:Ignorable="w14 w15 wp14">
+  <w:displayBackgroundShape/>
+  <w:evenAndOddHeaders w:val="false"/>
+  <w:compat>
+    <w:compatSetting w:val="15" w:name="compatibilityMode" w:uri="http://schemas.microsoft.com/office/word"/>
+  </w:compat>
+</w:settings>
+</file>
+
+<file path=word\styles.xml><?xml version="1.0" encoding="utf-8"?>
 <w:styles xmlns:mc="http://schemas.openxmlformats.org/markup-compatibility/2006" xmlns:r="http://schemas.openxmlformats.org/officeDocument/2006/relationships" xmlns:w="http://schemas.openxmlformats.org/wordprocessingml/2006/main" xmlns:w14="http://schemas.microsoft.com/office/word/2010/wordml" xmlns:w15="http://schemas.microsoft.com/office/word/2012/wordml" mc:Ignorable="w14 w15">
   <w:docDefaults>
     <w:rPrDefault>

</xml_diff>